<commit_message>
docs: cap nhat bao cao, slide va web viewer HUPH2026
- Doi ten bao cao toan van sang tieu de day du (19 chuong)
- Cap nhat slide thuyet trinh (19 slide, ban hoan chinh)
- Them web viewer slide HUPH2026 (HTML + PNG)
- Them script tom tat (_tmp_shorten_summary.py)
- Cap nhat bao cao tom tat

Co-Authored-By: Claude Sonnet 4.6 <noreply@anthropic.com>
</commit_message>
<xml_diff>
--- a/Bao_cao_tom_tat_Rehab_AI_Monitor.docx
+++ b/Bao_cao_tom_tat_Rehab_AI_Monitor.docx
@@ -348,11 +348,7 @@
         </w:rPr>
       </w:pPr>
       <w:r>
-        <w:rPr>
-          <w:sz w:val="26"/>
-          <w:szCs w:val="26"/>
-        </w:rPr>
-        <w:t xml:space="preserve">Phục hồi chức năng tại nhà thiếu giám sát là khoảng trống sau điều trị; bằng chứng thị giác máy tính marker-less còn hạn chế. Nghiên cứu thử nghiệm mô hình đánh giá động tác phục hồi chức năng khớp vai qua video smartphone, đối chiếu chuyên gia. Đối tượng là bệnh nhân viêm quanh khớp vai (ICD-10: M75) điều trị ngoại trú, thực hiện bài con lắc Codman và bài tập với gậy. Mô hình trích xuất 33 điểm mốc MediaPipe Pose, tính góc vai–khuỷu, phân loại ngưỡng ±45°/±30°/±15° (Codman), ±30° (gậy), kết hợp Random Forest; đối chiếu bác sĩ/kỹ thuật viên PHCN. Codman đạt ACC = 71,2% (PASS+NEAR = 89,5%; F1 = 0,75; ICC = 0,71; MAE = 13,5°; RMSE = 16,8°; Recall = 0,74; Precision = 0,75), bài gậy đạt ACC = 38,7% (PASS+NEAR = 47,3%; F1 = 0,46; ICC = 0,55; MAE = 21,4°; RMSE = 26,8°; Recall = 0,45; Precision = 0,48). Theo ba giai đoạn ±45°/±30°/±15°, độ chính xác Codman giảm dần 85,4%→79,3%→48,0%. Mô hình đồng thuận xu hướng song bỏ sót bù trừ tư thế. Marker-less có tiềm năng telerehabilitation tại Việt Nam; cần bổ sung tiêu chí tư thế, mở rộng mẫu.</w:t>
+        <w:t>Phục hồi chức năng tại nhà thiếu giám sát là khoảng trống sau điều trị; bằng chứng thị giác máy tính marker-less còn hạn chế. Nghiên cứu thử nghiệm mô hình đánh giá động tác phục hồi chức năng khớp vai qua video smartphone, đối chiếu chuyên gia. Đối tượng là bệnh nhân viêm quanh khớp vai (ICD-10: M75) điều trị ngoại trú, thực hiện bài con lắc Codman và bài tập với gậy. Mô hình trích xuất 33 điểm mốc MediaPipe Pose, tính góc vai-khuỷu, phân loại ngưỡng ±45°/±30°/±15° (Codman), ±30° (gậy), kết hợp Random Forest; đối chiếu bác sĩ/kỹ thuật viên PHCN. Theo dữ liệu cập nhật 24/06/2026, Codman đạt ACC = 71,2% (PASS+NEAR/tổng frame = 89,5%; F1 = 0,75; ICC = 0,71; MAE/RMSE = 13,5°/16,8°; Precision/Recall = 0,76/0,74), bài gậy đạt ACC = 38,7% (PASS+NEAR/tổng frame = 47,3%; F1 = 0,46; ICC = 0,55; MAE/RMSE = 21,4°/26,8°; Precision/Recall = 0,48/0,44). Theo ba giai đoạn Codman ±45°/±30°/±15°, độ chính xác giảm dần 85,4%→79,3%→48,0%. Mô hình đồng thuận xu hướng song bỏ sót bù trừ tư thế. Marker-less có tiềm năng telerehabilitation tại Việt Nam; cần bổ sung tiêu chí tư thế, mở rộng mẫu.</w:t>
       </w:r>
     </w:p>
     <w:p>

</xml_diff>